<commit_message>
docs: Refresh architecture doc (multi-washer, Plus tier, queue push-back, station trial)
Covers 4 features shipped since the 2026-08-21 refresh: multi-washer
assignment for bus/truck washes (7.7), client self-service queue
push-back via client_push_back_reservation (6.1, 7.8), the Plus
subscription tier and its client_vehicle_cap() RLS rewrite (5, 6.1,
6.3, 7.3), and the 1-month station trial with daily progress bar (5,
7.9).
</commit_message>
<xml_diff>
--- a/docs/Architecture-Technique-CleanCarGalsen.docx
+++ b/docs/Architecture-Technique-CleanCarGalsen.docx
@@ -57,7 +57,7 @@
           <w:iCs/>
           <w:color w:val="595959"/>
         </w:rPr>
-        <w:t xml:space="preserve">Généré le 19 août 2026 — mis à jour le 21 août 2026</w:t>
+        <w:t xml:space="preserve">Généré le 19 août 2026 — mis à jour le 24 août 2026</w:t>
       </w:r>
     </w:p>
     <w:p>
@@ -87,7 +87,7 @@
         <w:spacing w:after="60"/>
       </w:pPr>
       <w:r>
-        <w:t xml:space="preserve">Automobiliste (client) : recherche une station, réserve un lavage, suit sa file d'attente en direct, paie en ligne ou sur place, gère son garage de véhicules, et peut désormais souscrire un abonnement fidélité prépayé auprès d'une station.</w:t>
+        <w:t xml:space="preserve">Automobiliste (client) : recherche une station, réserve un lavage, suit sa file d'attente en direct (et peut, s'il est abonné à la station, reculer lui-même sa place), paie en ligne ou sur place, gère son garage de véhicules (2 gratuits, 5 avec l'offre Plus, illimité avec Super User), et peut souscrire un abonnement fidélité prépayé auprès d'une station.</w:t>
       </w:r>
     </w:p>
     <w:p>
@@ -278,7 +278,7 @@
         <w:spacing w:after="60"/>
       </w:pPr>
       <w:r>
-        <w:t xml:space="preserve">Tâches planifiées : Aucune (pas d'Edge Function/cron) — les statuts qui "expirent" (abonnement Super User, publicité, bandeau promo) sont recalculés à la volée à chaque lecture plutôt que mis à jour en base par un job.</w:t>
+        <w:t xml:space="preserve">Tâches planifiées : Aucune (pas d'Edge Function/cron) — les statuts qui "expirent" (abonnement Plus/Super User, publicité, bandeau promo, essai station) sont recalculés à la volée à chaque lecture plutôt que mis à jour en base par un job.</w:t>
       </w:r>
     </w:p>
     <w:p>
@@ -321,7 +321,7 @@
         <w:spacing w:after="60"/>
       </w:pPr>
       <w:r>
-        <w:t xml:space="preserve">Paiement "abonnement" (Super User automobiliste, Publicité station) : le client/la station saisit un numéro et clique payer, ce qui crée une ligne en base au statut PENDING. Seul le Super Admin peut la faire passer à ACTIVE, une fois l'argent réellement reçu par un autre canal (Wave/OM manuel). Aucune activation automatique n'existe. La publicité station propose désormais 3 offres de durée (3 jours / 1 semaine / 1 mois, prix croissants) au lieu d'une offre unique.</w:t>
+        <w:t xml:space="preserve">Paiement "abonnement" (Plus/Super User automobiliste, Publicité station) : le client/la station saisit un numéro et clique payer, ce qui crée une ligne en base au statut PENDING. Seul le Super Admin peut la faire passer à ACTIVE, une fois l'argent réellement reçu par un autre canal (Wave/OM manuel). Aucune activation automatique n'existe. Côté automobiliste, deux offres payantes coexistent depuis le 22 août 2026 (Plus et Super User — voir section 6.3). La publicité station propose 3 offres de durée (3 jours / 1 semaine / 1 mois, prix croissants) au lieu d'une offre unique.</w:t>
       </w:r>
     </w:p>
     <w:p>
@@ -376,7 +376,13 @@
         <w:tc>
           <w:tcPr>
             <w:tcW w:type="pct" w:w="25%"/>
-            <w:shd w:fill="1F3864"/>
+            <w:tcBorders>
+              <w:top w:val="single" w:color="auto" w:sz="4"/>
+              <w:left w:val="single" w:color="auto" w:sz="4"/>
+              <w:bottom w:val="single" w:color="auto" w:sz="4"/>
+              <w:right w:val="single" w:color="auto" w:sz="4"/>
+            </w:tcBorders>
+            <w:shd w:fill="1F3864" w:color="1F3864" w:val="solid"/>
           </w:tcPr>
           <w:p>
             <w:r>
@@ -392,7 +398,13 @@
         <w:tc>
           <w:tcPr>
             <w:tcW w:type="pct" w:w="25%"/>
-            <w:shd w:fill="1F3864"/>
+            <w:tcBorders>
+              <w:top w:val="single" w:color="auto" w:sz="4"/>
+              <w:left w:val="single" w:color="auto" w:sz="4"/>
+              <w:bottom w:val="single" w:color="auto" w:sz="4"/>
+              <w:right w:val="single" w:color="auto" w:sz="4"/>
+            </w:tcBorders>
+            <w:shd w:fill="1F3864" w:color="1F3864" w:val="solid"/>
           </w:tcPr>
           <w:p>
             <w:r>
@@ -408,7 +420,13 @@
         <w:tc>
           <w:tcPr>
             <w:tcW w:type="pct" w:w="25%"/>
-            <w:shd w:fill="1F3864"/>
+            <w:tcBorders>
+              <w:top w:val="single" w:color="auto" w:sz="4"/>
+              <w:left w:val="single" w:color="auto" w:sz="4"/>
+              <w:bottom w:val="single" w:color="auto" w:sz="4"/>
+              <w:right w:val="single" w:color="auto" w:sz="4"/>
+            </w:tcBorders>
+            <w:shd w:fill="1F3864" w:color="1F3864" w:val="solid"/>
           </w:tcPr>
           <w:p>
             <w:r>
@@ -424,7 +442,13 @@
         <w:tc>
           <w:tcPr>
             <w:tcW w:type="pct" w:w="25%"/>
-            <w:shd w:fill="1F3864"/>
+            <w:tcBorders>
+              <w:top w:val="single" w:color="auto" w:sz="4"/>
+              <w:left w:val="single" w:color="auto" w:sz="4"/>
+              <w:bottom w:val="single" w:color="auto" w:sz="4"/>
+              <w:right w:val="single" w:color="auto" w:sz="4"/>
+            </w:tcBorders>
+            <w:shd w:fill="1F3864" w:color="1F3864" w:val="solid"/>
           </w:tcPr>
           <w:p>
             <w:r>
@@ -442,14 +466,15 @@
         <w:tc>
           <w:tcPr>
             <w:tcW w:type="pct" w:w="25%"/>
-          </w:tcPr>
-          <w:p>
-            <w:r>
-              <w:rPr>
-                <w:b w:val="false"/>
-                <w:bCs w:val="false"/>
-                <w:color w:val="000000"/>
-              </w:rPr>
+            <w:tcBorders>
+              <w:top w:val="single" w:color="auto" w:sz="4"/>
+              <w:left w:val="single" w:color="auto" w:sz="4"/>
+              <w:bottom w:val="single" w:color="auto" w:sz="4"/>
+              <w:right w:val="single" w:color="auto" w:sz="4"/>
+            </w:tcBorders>
+          </w:tcPr>
+          <w:p>
+            <w:r>
               <w:t xml:space="preserve">Public / vitrine</w:t>
             </w:r>
           </w:p>
@@ -457,14 +482,15 @@
         <w:tc>
           <w:tcPr>
             <w:tcW w:type="pct" w:w="25%"/>
-          </w:tcPr>
-          <w:p>
-            <w:r>
-              <w:rPr>
-                <w:b w:val="false"/>
-                <w:bCs w:val="false"/>
-                <w:color w:val="000000"/>
-              </w:rPr>
+            <w:tcBorders>
+              <w:top w:val="single" w:color="auto" w:sz="4"/>
+              <w:left w:val="single" w:color="auto" w:sz="4"/>
+              <w:bottom w:val="single" w:color="auto" w:sz="4"/>
+              <w:right w:val="single" w:color="auto" w:sz="4"/>
+            </w:tcBorders>
+          </w:tcPr>
+          <w:p>
+            <w:r>
               <w:t xml:space="preserve">/ , /stations</w:t>
             </w:r>
           </w:p>
@@ -472,14 +498,15 @@
         <w:tc>
           <w:tcPr>
             <w:tcW w:type="pct" w:w="25%"/>
-          </w:tcPr>
-          <w:p>
-            <w:r>
-              <w:rPr>
-                <w:b w:val="false"/>
-                <w:bCs w:val="false"/>
-                <w:color w:val="000000"/>
-              </w:rPr>
+            <w:tcBorders>
+              <w:top w:val="single" w:color="auto" w:sz="4"/>
+              <w:left w:val="single" w:color="auto" w:sz="4"/>
+              <w:bottom w:val="single" w:color="auto" w:sz="4"/>
+              <w:right w:val="single" w:color="auto" w:sz="4"/>
+            </w:tcBorders>
+          </w:tcPr>
+          <w:p>
+            <w:r>
               <w:t xml:space="preserve">MainLayout</w:t>
             </w:r>
           </w:p>
@@ -487,14 +514,15 @@
         <w:tc>
           <w:tcPr>
             <w:tcW w:type="pct" w:w="25%"/>
-          </w:tcPr>
-          <w:p>
-            <w:r>
-              <w:rPr>
-                <w:b w:val="false"/>
-                <w:bCs w:val="false"/>
-                <w:color w:val="000000"/>
-              </w:rPr>
+            <w:tcBorders>
+              <w:top w:val="single" w:color="auto" w:sz="4"/>
+              <w:left w:val="single" w:color="auto" w:sz="4"/>
+              <w:bottom w:val="single" w:color="auto" w:sz="4"/>
+              <w:right w:val="single" w:color="auto" w:sz="4"/>
+            </w:tcBorders>
+          </w:tcPr>
+          <w:p>
+            <w:r>
               <w:t xml:space="preserve">—</w:t>
             </w:r>
           </w:p>
@@ -504,14 +532,15 @@
         <w:tc>
           <w:tcPr>
             <w:tcW w:type="pct" w:w="25%"/>
-          </w:tcPr>
-          <w:p>
-            <w:r>
-              <w:rPr>
-                <w:b w:val="false"/>
-                <w:bCs w:val="false"/>
-                <w:color w:val="000000"/>
-              </w:rPr>
+            <w:tcBorders>
+              <w:top w:val="single" w:color="auto" w:sz="4"/>
+              <w:left w:val="single" w:color="auto" w:sz="4"/>
+              <w:bottom w:val="single" w:color="auto" w:sz="4"/>
+              <w:right w:val="single" w:color="auto" w:sz="4"/>
+            </w:tcBorders>
+          </w:tcPr>
+          <w:p>
+            <w:r>
               <w:t xml:space="preserve">Automobiliste</w:t>
             </w:r>
           </w:p>
@@ -519,14 +548,15 @@
         <w:tc>
           <w:tcPr>
             <w:tcW w:type="pct" w:w="25%"/>
-          </w:tcPr>
-          <w:p>
-            <w:r>
-              <w:rPr>
-                <w:b w:val="false"/>
-                <w:bCs w:val="false"/>
-                <w:color w:val="000000"/>
-              </w:rPr>
+            <w:tcBorders>
+              <w:top w:val="single" w:color="auto" w:sz="4"/>
+              <w:left w:val="single" w:color="auto" w:sz="4"/>
+              <w:bottom w:val="single" w:color="auto" w:sz="4"/>
+              <w:right w:val="single" w:color="auto" w:sz="4"/>
+            </w:tcBorders>
+          </w:tcPr>
+          <w:p>
+            <w:r>
               <w:t xml:space="preserve">/dashboard/*</w:t>
             </w:r>
           </w:p>
@@ -534,14 +564,15 @@
         <w:tc>
           <w:tcPr>
             <w:tcW w:type="pct" w:w="25%"/>
-          </w:tcPr>
-          <w:p>
-            <w:r>
-              <w:rPr>
-                <w:b w:val="false"/>
-                <w:bCs w:val="false"/>
-                <w:color w:val="000000"/>
-              </w:rPr>
+            <w:tcBorders>
+              <w:top w:val="single" w:color="auto" w:sz="4"/>
+              <w:left w:val="single" w:color="auto" w:sz="4"/>
+              <w:bottom w:val="single" w:color="auto" w:sz="4"/>
+              <w:right w:val="single" w:color="auto" w:sz="4"/>
+            </w:tcBorders>
+          </w:tcPr>
+          <w:p>
+            <w:r>
               <w:t xml:space="preserve">ClientLayout</w:t>
             </w:r>
           </w:p>
@@ -549,14 +580,15 @@
         <w:tc>
           <w:tcPr>
             <w:tcW w:type="pct" w:w="25%"/>
-          </w:tcPr>
-          <w:p>
-            <w:r>
-              <w:rPr>
-                <w:b w:val="false"/>
-                <w:bCs w:val="false"/>
-                <w:color w:val="000000"/>
-              </w:rPr>
+            <w:tcBorders>
+              <w:top w:val="single" w:color="auto" w:sz="4"/>
+              <w:left w:val="single" w:color="auto" w:sz="4"/>
+              <w:bottom w:val="single" w:color="auto" w:sz="4"/>
+              <w:right w:val="single" w:color="auto" w:sz="4"/>
+            </w:tcBorders>
+          </w:tcPr>
+          <w:p>
+            <w:r>
               <w:t xml:space="preserve">ClientAccountProvider</w:t>
             </w:r>
           </w:p>
@@ -566,14 +598,15 @@
         <w:tc>
           <w:tcPr>
             <w:tcW w:type="pct" w:w="25%"/>
-          </w:tcPr>
-          <w:p>
-            <w:r>
-              <w:rPr>
-                <w:b w:val="false"/>
-                <w:bCs w:val="false"/>
-                <w:color w:val="000000"/>
-              </w:rPr>
+            <w:tcBorders>
+              <w:top w:val="single" w:color="auto" w:sz="4"/>
+              <w:left w:val="single" w:color="auto" w:sz="4"/>
+              <w:bottom w:val="single" w:color="auto" w:sz="4"/>
+              <w:right w:val="single" w:color="auto" w:sz="4"/>
+            </w:tcBorders>
+          </w:tcPr>
+          <w:p>
+            <w:r>
               <w:t xml:space="preserve">Station</w:t>
             </w:r>
           </w:p>
@@ -581,14 +614,15 @@
         <w:tc>
           <w:tcPr>
             <w:tcW w:type="pct" w:w="25%"/>
-          </w:tcPr>
-          <w:p>
-            <w:r>
-              <w:rPr>
-                <w:b w:val="false"/>
-                <w:bCs w:val="false"/>
-                <w:color w:val="000000"/>
-              </w:rPr>
+            <w:tcBorders>
+              <w:top w:val="single" w:color="auto" w:sz="4"/>
+              <w:left w:val="single" w:color="auto" w:sz="4"/>
+              <w:bottom w:val="single" w:color="auto" w:sz="4"/>
+              <w:right w:val="single" w:color="auto" w:sz="4"/>
+            </w:tcBorders>
+          </w:tcPr>
+          <w:p>
+            <w:r>
               <w:t xml:space="preserve">/admin/*</w:t>
             </w:r>
           </w:p>
@@ -596,14 +630,15 @@
         <w:tc>
           <w:tcPr>
             <w:tcW w:type="pct" w:w="25%"/>
-          </w:tcPr>
-          <w:p>
-            <w:r>
-              <w:rPr>
-                <w:b w:val="false"/>
-                <w:bCs w:val="false"/>
-                <w:color w:val="000000"/>
-              </w:rPr>
+            <w:tcBorders>
+              <w:top w:val="single" w:color="auto" w:sz="4"/>
+              <w:left w:val="single" w:color="auto" w:sz="4"/>
+              <w:bottom w:val="single" w:color="auto" w:sz="4"/>
+              <w:right w:val="single" w:color="auto" w:sz="4"/>
+            </w:tcBorders>
+          </w:tcPr>
+          <w:p>
+            <w:r>
               <w:t xml:space="preserve">AdminLayout</w:t>
             </w:r>
           </w:p>
@@ -611,14 +646,15 @@
         <w:tc>
           <w:tcPr>
             <w:tcW w:type="pct" w:w="25%"/>
-          </w:tcPr>
-          <w:p>
-            <w:r>
-              <w:rPr>
-                <w:b w:val="false"/>
-                <w:bCs w:val="false"/>
-                <w:color w:val="000000"/>
-              </w:rPr>
+            <w:tcBorders>
+              <w:top w:val="single" w:color="auto" w:sz="4"/>
+              <w:left w:val="single" w:color="auto" w:sz="4"/>
+              <w:bottom w:val="single" w:color="auto" w:sz="4"/>
+              <w:right w:val="single" w:color="auto" w:sz="4"/>
+            </w:tcBorders>
+          </w:tcPr>
+          <w:p>
+            <w:r>
               <w:t xml:space="preserve">AppStateProvider</w:t>
             </w:r>
           </w:p>
@@ -628,14 +664,15 @@
         <w:tc>
           <w:tcPr>
             <w:tcW w:type="pct" w:w="25%"/>
-          </w:tcPr>
-          <w:p>
-            <w:r>
-              <w:rPr>
-                <w:b w:val="false"/>
-                <w:bCs w:val="false"/>
-                <w:color w:val="000000"/>
-              </w:rPr>
+            <w:tcBorders>
+              <w:top w:val="single" w:color="auto" w:sz="4"/>
+              <w:left w:val="single" w:color="auto" w:sz="4"/>
+              <w:bottom w:val="single" w:color="auto" w:sz="4"/>
+              <w:right w:val="single" w:color="auto" w:sz="4"/>
+            </w:tcBorders>
+          </w:tcPr>
+          <w:p>
+            <w:r>
               <w:t xml:space="preserve">Super Admin</w:t>
             </w:r>
           </w:p>
@@ -643,14 +680,15 @@
         <w:tc>
           <w:tcPr>
             <w:tcW w:type="pct" w:w="25%"/>
-          </w:tcPr>
-          <w:p>
-            <w:r>
-              <w:rPr>
-                <w:b w:val="false"/>
-                <w:bCs w:val="false"/>
-                <w:color w:val="000000"/>
-              </w:rPr>
+            <w:tcBorders>
+              <w:top w:val="single" w:color="auto" w:sz="4"/>
+              <w:left w:val="single" w:color="auto" w:sz="4"/>
+              <w:bottom w:val="single" w:color="auto" w:sz="4"/>
+              <w:right w:val="single" w:color="auto" w:sz="4"/>
+            </w:tcBorders>
+          </w:tcPr>
+          <w:p>
+            <w:r>
               <w:t xml:space="preserve">/superadmin/*</w:t>
             </w:r>
           </w:p>
@@ -658,14 +696,15 @@
         <w:tc>
           <w:tcPr>
             <w:tcW w:type="pct" w:w="25%"/>
-          </w:tcPr>
-          <w:p>
-            <w:r>
-              <w:rPr>
-                <w:b w:val="false"/>
-                <w:bCs w:val="false"/>
-                <w:color w:val="000000"/>
-              </w:rPr>
+            <w:tcBorders>
+              <w:top w:val="single" w:color="auto" w:sz="4"/>
+              <w:left w:val="single" w:color="auto" w:sz="4"/>
+              <w:bottom w:val="single" w:color="auto" w:sz="4"/>
+              <w:right w:val="single" w:color="auto" w:sz="4"/>
+            </w:tcBorders>
+          </w:tcPr>
+          <w:p>
+            <w:r>
               <w:t xml:space="preserve">SuperAdminLayout</w:t>
             </w:r>
           </w:p>
@@ -673,14 +712,15 @@
         <w:tc>
           <w:tcPr>
             <w:tcW w:type="pct" w:w="25%"/>
-          </w:tcPr>
-          <w:p>
-            <w:r>
-              <w:rPr>
-                <w:b w:val="false"/>
-                <w:bCs w:val="false"/>
-                <w:color w:val="000000"/>
-              </w:rPr>
+            <w:tcBorders>
+              <w:top w:val="single" w:color="auto" w:sz="4"/>
+              <w:left w:val="single" w:color="auto" w:sz="4"/>
+              <w:bottom w:val="single" w:color="auto" w:sz="4"/>
+              <w:right w:val="single" w:color="auto" w:sz="4"/>
+            </w:tcBorders>
+          </w:tcPr>
+          <w:p>
+            <w:r>
               <w:t xml:space="preserve">SuperAdminStateProvider</w:t>
             </w:r>
           </w:p>
@@ -689,11 +729,8 @@
     </w:tbl>
     <w:p>
       <w:pPr>
-        <w:spacing w:after="120"/>
-      </w:pPr>
-      <w:r>
-        <w:t xml:space="preserve"/>
-      </w:r>
+        <w:spacing w:after="0"/>
+      </w:pPr>
     </w:p>
     <w:p>
       <w:pPr>
@@ -841,6 +878,19 @@
         <w:spacing w:after="60"/>
       </w:pPr>
       <w:r>
+        <w:t xml:space="preserve">Facturation de la station et essai gratuit en cours, avec sa date de fin (station_billing, trial_ends_at)</w:t>
+      </w:r>
+    </w:p>
+    <w:p>
+      <w:pPr>
+        <w:pStyle w:val="ListParagraph"/>
+        <w:numPr>
+          <w:ilvl w:val="0"/>
+          <w:numId w:val="1"/>
+        </w:numPr>
+        <w:spacing w:after="60"/>
+      </w:pPr>
+      <w:r>
         <w:t xml:space="preserve">Configuration des promotions gratuites (promo_config)</w:t>
       </w:r>
     </w:p>
@@ -923,7 +973,7 @@
         <w:spacing w:after="60"/>
       </w:pPr>
       <w:r>
-        <w:t xml:space="preserve">Abonnements Super User (super_user_subscriptions)</w:t>
+        <w:t xml:space="preserve">Abonnements automobilistes payants — Plus et Super User (super_user_subscriptions, colonne plan)</w:t>
       </w:r>
     </w:p>
     <w:p>
@@ -966,7 +1016,7 @@
         <w:spacing w:after="120"/>
       </w:pPr>
       <w:r>
-        <w:t xml:space="preserve">Profil, véhicules, réservations actives, historique de transactions, abonnements fidélité actifs (par station), statut Super User, favoris/stations masquées, publicités ignorées (dismissed_ad_ids). Le canal Realtime sur reservations distingue désormais l'événement INSERT des autres (UPDATE/DELETE) pour déclencher une notification navigateur dédiée quand une réservation apparaît pour la première fois — typiquement quand une station vient de reconnaître ce client via sa plaque pendant un paiement manuel (voir section 7.6).</w:t>
+        <w:t xml:space="preserve">Profil, véhicules, réservations actives, historique de transactions, abonnements fidélité actifs (par station), offre payante active (Plus ou Super User), favoris/stations masquées, publicités ignorées (dismissed_ad_ids). Le canal Realtime sur reservations distingue désormais l'événement INSERT des autres (UPDATE/DELETE) pour déclencher une notification navigateur dédiée quand une réservation apparaît pour la première fois — typiquement quand une station vient de reconnaître ce client via sa plaque pendant un paiement manuel (voir section 7.6).</w:t>
       </w:r>
     </w:p>
     <w:p>
@@ -1062,7 +1112,13 @@
         <w:tc>
           <w:tcPr>
             <w:tcW w:type="pct" w:w="40%"/>
-            <w:shd w:fill="1F3864"/>
+            <w:tcBorders>
+              <w:top w:val="single" w:color="auto" w:sz="4"/>
+              <w:left w:val="single" w:color="auto" w:sz="4"/>
+              <w:bottom w:val="single" w:color="auto" w:sz="4"/>
+              <w:right w:val="single" w:color="auto" w:sz="4"/>
+            </w:tcBorders>
+            <w:shd w:fill="1F3864" w:color="1F3864" w:val="solid"/>
           </w:tcPr>
           <w:p>
             <w:r>
@@ -1078,7 +1134,13 @@
         <w:tc>
           <w:tcPr>
             <w:tcW w:type="pct" w:w="60%"/>
-            <w:shd w:fill="1F3864"/>
+            <w:tcBorders>
+              <w:top w:val="single" w:color="auto" w:sz="4"/>
+              <w:left w:val="single" w:color="auto" w:sz="4"/>
+              <w:bottom w:val="single" w:color="auto" w:sz="4"/>
+              <w:right w:val="single" w:color="auto" w:sz="4"/>
+            </w:tcBorders>
+            <w:shd w:fill="1F3864" w:color="1F3864" w:val="solid"/>
           </w:tcPr>
           <w:p>
             <w:r>
@@ -1096,14 +1158,15 @@
         <w:tc>
           <w:tcPr>
             <w:tcW w:type="pct" w:w="40%"/>
-          </w:tcPr>
-          <w:p>
-            <w:r>
-              <w:rPr>
-                <w:b w:val="false"/>
-                <w:bCs w:val="false"/>
-                <w:color w:val="000000"/>
-              </w:rPr>
+            <w:tcBorders>
+              <w:top w:val="single" w:color="auto" w:sz="4"/>
+              <w:left w:val="single" w:color="auto" w:sz="4"/>
+              <w:bottom w:val="single" w:color="auto" w:sz="4"/>
+              <w:right w:val="single" w:color="auto" w:sz="4"/>
+            </w:tcBorders>
+          </w:tcPr>
+          <w:p>
+            <w:r>
               <w:t xml:space="preserve">Stations &amp; facturation SaaS</w:t>
             </w:r>
           </w:p>
@@ -1111,14 +1174,15 @@
         <w:tc>
           <w:tcPr>
             <w:tcW w:type="pct" w:w="60%"/>
-          </w:tcPr>
-          <w:p>
-            <w:r>
-              <w:rPr>
-                <w:b w:val="false"/>
-                <w:bCs w:val="false"/>
-                <w:color w:val="000000"/>
-              </w:rPr>
+            <w:tcBorders>
+              <w:top w:val="single" w:color="auto" w:sz="4"/>
+              <w:left w:val="single" w:color="auto" w:sz="4"/>
+              <w:bottom w:val="single" w:color="auto" w:sz="4"/>
+              <w:right w:val="single" w:color="auto" w:sz="4"/>
+            </w:tcBorders>
+          </w:tcPr>
+          <w:p>
+            <w:r>
               <w:t xml:space="preserve">stations, station_billing, plans</w:t>
             </w:r>
           </w:p>
@@ -1128,14 +1192,15 @@
         <w:tc>
           <w:tcPr>
             <w:tcW w:type="pct" w:w="40%"/>
-          </w:tcPr>
-          <w:p>
-            <w:r>
-              <w:rPr>
-                <w:b w:val="false"/>
-                <w:bCs w:val="false"/>
-                <w:color w:val="000000"/>
-              </w:rPr>
+            <w:tcBorders>
+              <w:top w:val="single" w:color="auto" w:sz="4"/>
+              <w:left w:val="single" w:color="auto" w:sz="4"/>
+              <w:bottom w:val="single" w:color="auto" w:sz="4"/>
+              <w:right w:val="single" w:color="auto" w:sz="4"/>
+            </w:tcBorders>
+          </w:tcPr>
+          <w:p>
+            <w:r>
               <w:t xml:space="preserve">Comptes &amp; authentification</w:t>
             </w:r>
           </w:p>
@@ -1143,14 +1208,15 @@
         <w:tc>
           <w:tcPr>
             <w:tcW w:type="pct" w:w="60%"/>
-          </w:tcPr>
-          <w:p>
-            <w:r>
-              <w:rPr>
-                <w:b w:val="false"/>
-                <w:bCs w:val="false"/>
-                <w:color w:val="000000"/>
-              </w:rPr>
+            <w:tcBorders>
+              <w:top w:val="single" w:color="auto" w:sz="4"/>
+              <w:left w:val="single" w:color="auto" w:sz="4"/>
+              <w:bottom w:val="single" w:color="auto" w:sz="4"/>
+              <w:right w:val="single" w:color="auto" w:sz="4"/>
+            </w:tcBorders>
+          </w:tcPr>
+          <w:p>
+            <w:r>
               <w:t xml:space="preserve">profiles, vehicles</w:t>
             </w:r>
           </w:p>
@@ -1160,14 +1226,15 @@
         <w:tc>
           <w:tcPr>
             <w:tcW w:type="pct" w:w="40%"/>
-          </w:tcPr>
-          <w:p>
-            <w:r>
-              <w:rPr>
-                <w:b w:val="false"/>
-                <w:bCs w:val="false"/>
-                <w:color w:val="000000"/>
-              </w:rPr>
+            <w:tcBorders>
+              <w:top w:val="single" w:color="auto" w:sz="4"/>
+              <w:left w:val="single" w:color="auto" w:sz="4"/>
+              <w:bottom w:val="single" w:color="auto" w:sz="4"/>
+              <w:right w:val="single" w:color="auto" w:sz="4"/>
+            </w:tcBorders>
+          </w:tcPr>
+          <w:p>
+            <w:r>
               <w:t xml:space="preserve">Réservations &amp; paiements</w:t>
             </w:r>
           </w:p>
@@ -1175,14 +1242,15 @@
         <w:tc>
           <w:tcPr>
             <w:tcW w:type="pct" w:w="60%"/>
-          </w:tcPr>
-          <w:p>
-            <w:r>
-              <w:rPr>
-                <w:b w:val="false"/>
-                <w:bCs w:val="false"/>
-                <w:color w:val="000000"/>
-              </w:rPr>
+            <w:tcBorders>
+              <w:top w:val="single" w:color="auto" w:sz="4"/>
+              <w:left w:val="single" w:color="auto" w:sz="4"/>
+              <w:bottom w:val="single" w:color="auto" w:sz="4"/>
+              <w:right w:val="single" w:color="auto" w:sz="4"/>
+            </w:tcBorders>
+          </w:tcPr>
+          <w:p>
+            <w:r>
               <w:t xml:space="preserve">reservations, transactions, wash_pricing</w:t>
             </w:r>
           </w:p>
@@ -1192,14 +1260,15 @@
         <w:tc>
           <w:tcPr>
             <w:tcW w:type="pct" w:w="40%"/>
-          </w:tcPr>
-          <w:p>
-            <w:r>
-              <w:rPr>
-                <w:b w:val="false"/>
-                <w:bCs w:val="false"/>
-                <w:color w:val="000000"/>
-              </w:rPr>
+            <w:tcBorders>
+              <w:top w:val="single" w:color="auto" w:sz="4"/>
+              <w:left w:val="single" w:color="auto" w:sz="4"/>
+              <w:bottom w:val="single" w:color="auto" w:sz="4"/>
+              <w:right w:val="single" w:color="auto" w:sz="4"/>
+            </w:tcBorders>
+          </w:tcPr>
+          <w:p>
+            <w:r>
               <w:t xml:space="preserve">Équipe station</w:t>
             </w:r>
           </w:p>
@@ -1207,14 +1276,15 @@
         <w:tc>
           <w:tcPr>
             <w:tcW w:type="pct" w:w="60%"/>
-          </w:tcPr>
-          <w:p>
-            <w:r>
-              <w:rPr>
-                <w:b w:val="false"/>
-                <w:bCs w:val="false"/>
-                <w:color w:val="000000"/>
-              </w:rPr>
+            <w:tcBorders>
+              <w:top w:val="single" w:color="auto" w:sz="4"/>
+              <w:left w:val="single" w:color="auto" w:sz="4"/>
+              <w:bottom w:val="single" w:color="auto" w:sz="4"/>
+              <w:right w:val="single" w:color="auto" w:sz="4"/>
+            </w:tcBorders>
+          </w:tcPr>
+          <w:p>
+            <w:r>
               <w:t xml:space="preserve">employees, attendance_records, shift_templates, shift_schedule</w:t>
             </w:r>
           </w:p>
@@ -1224,14 +1294,15 @@
         <w:tc>
           <w:tcPr>
             <w:tcW w:type="pct" w:w="40%"/>
-          </w:tcPr>
-          <w:p>
-            <w:r>
-              <w:rPr>
-                <w:b w:val="false"/>
-                <w:bCs w:val="false"/>
-                <w:color w:val="000000"/>
-              </w:rPr>
+            <w:tcBorders>
+              <w:top w:val="single" w:color="auto" w:sz="4"/>
+              <w:left w:val="single" w:color="auto" w:sz="4"/>
+              <w:bottom w:val="single" w:color="auto" w:sz="4"/>
+              <w:right w:val="single" w:color="auto" w:sz="4"/>
+            </w:tcBorders>
+          </w:tcPr>
+          <w:p>
+            <w:r>
               <w:t xml:space="preserve">Fidélisation &amp; avis</w:t>
             </w:r>
           </w:p>
@@ -1239,14 +1310,15 @@
         <w:tc>
           <w:tcPr>
             <w:tcW w:type="pct" w:w="60%"/>
-          </w:tcPr>
-          <w:p>
-            <w:r>
-              <w:rPr>
-                <w:b w:val="false"/>
-                <w:bCs w:val="false"/>
-                <w:color w:val="000000"/>
-              </w:rPr>
+            <w:tcBorders>
+              <w:top w:val="single" w:color="auto" w:sz="4"/>
+              <w:left w:val="single" w:color="auto" w:sz="4"/>
+              <w:bottom w:val="single" w:color="auto" w:sz="4"/>
+              <w:right w:val="single" w:color="auto" w:sz="4"/>
+            </w:tcBorders>
+          </w:tcPr>
+          <w:p>
+            <w:r>
               <w:t xml:space="preserve">station_reviews</w:t>
             </w:r>
           </w:p>
@@ -1256,14 +1328,15 @@
         <w:tc>
           <w:tcPr>
             <w:tcW w:type="pct" w:w="40%"/>
-          </w:tcPr>
-          <w:p>
-            <w:r>
-              <w:rPr>
-                <w:b w:val="false"/>
-                <w:bCs w:val="false"/>
-                <w:color w:val="000000"/>
-              </w:rPr>
+            <w:tcBorders>
+              <w:top w:val="single" w:color="auto" w:sz="4"/>
+              <w:left w:val="single" w:color="auto" w:sz="4"/>
+              <w:bottom w:val="single" w:color="auto" w:sz="4"/>
+              <w:right w:val="single" w:color="auto" w:sz="4"/>
+            </w:tcBorders>
+          </w:tcPr>
+          <w:p>
+            <w:r>
               <w:t xml:space="preserve">Abonnements clients fidélité (station)</w:t>
             </w:r>
           </w:p>
@@ -1271,14 +1344,15 @@
         <w:tc>
           <w:tcPr>
             <w:tcW w:type="pct" w:w="60%"/>
-          </w:tcPr>
-          <w:p>
-            <w:r>
-              <w:rPr>
-                <w:b w:val="false"/>
-                <w:bCs w:val="false"/>
-                <w:color w:val="000000"/>
-              </w:rPr>
+            <w:tcBorders>
+              <w:top w:val="single" w:color="auto" w:sz="4"/>
+              <w:left w:val="single" w:color="auto" w:sz="4"/>
+              <w:bottom w:val="single" w:color="auto" w:sz="4"/>
+              <w:right w:val="single" w:color="auto" w:sz="4"/>
+            </w:tcBorders>
+          </w:tcPr>
+          <w:p>
+            <w:r>
               <w:t xml:space="preserve">station_client_subscriptions, station_subscription_invoices</w:t>
             </w:r>
           </w:p>
@@ -1288,14 +1362,15 @@
         <w:tc>
           <w:tcPr>
             <w:tcW w:type="pct" w:w="40%"/>
-          </w:tcPr>
-          <w:p>
-            <w:r>
-              <w:rPr>
-                <w:b w:val="false"/>
-                <w:bCs w:val="false"/>
-                <w:color w:val="000000"/>
-              </w:rPr>
+            <w:tcBorders>
+              <w:top w:val="single" w:color="auto" w:sz="4"/>
+              <w:left w:val="single" w:color="auto" w:sz="4"/>
+              <w:bottom w:val="single" w:color="auto" w:sz="4"/>
+              <w:right w:val="single" w:color="auto" w:sz="4"/>
+            </w:tcBorders>
+          </w:tcPr>
+          <w:p>
+            <w:r>
               <w:t xml:space="preserve">Monétisation plateforme</w:t>
             </w:r>
           </w:p>
@@ -1303,14 +1378,15 @@
         <w:tc>
           <w:tcPr>
             <w:tcW w:type="pct" w:w="60%"/>
-          </w:tcPr>
-          <w:p>
-            <w:r>
-              <w:rPr>
-                <w:b w:val="false"/>
-                <w:bCs w:val="false"/>
-                <w:color w:val="000000"/>
-              </w:rPr>
+            <w:tcBorders>
+              <w:top w:val="single" w:color="auto" w:sz="4"/>
+              <w:left w:val="single" w:color="auto" w:sz="4"/>
+              <w:bottom w:val="single" w:color="auto" w:sz="4"/>
+              <w:right w:val="single" w:color="auto" w:sz="4"/>
+            </w:tcBorders>
+          </w:tcPr>
+          <w:p>
+            <w:r>
               <w:t xml:space="preserve">super_user_subscriptions, station_ads</w:t>
             </w:r>
           </w:p>
@@ -1320,14 +1396,15 @@
         <w:tc>
           <w:tcPr>
             <w:tcW w:type="pct" w:w="40%"/>
-          </w:tcPr>
-          <w:p>
-            <w:r>
-              <w:rPr>
-                <w:b w:val="false"/>
-                <w:bCs w:val="false"/>
-                <w:color w:val="000000"/>
-              </w:rPr>
+            <w:tcBorders>
+              <w:top w:val="single" w:color="auto" w:sz="4"/>
+              <w:left w:val="single" w:color="auto" w:sz="4"/>
+              <w:bottom w:val="single" w:color="auto" w:sz="4"/>
+              <w:right w:val="single" w:color="auto" w:sz="4"/>
+            </w:tcBorders>
+          </w:tcPr>
+          <w:p>
+            <w:r>
               <w:t xml:space="preserve">Référentiels partagés</w:t>
             </w:r>
           </w:p>
@@ -1335,14 +1412,15 @@
         <w:tc>
           <w:tcPr>
             <w:tcW w:type="pct" w:w="60%"/>
-          </w:tcPr>
-          <w:p>
-            <w:r>
-              <w:rPr>
-                <w:b w:val="false"/>
-                <w:bCs w:val="false"/>
-                <w:color w:val="000000"/>
-              </w:rPr>
+            <w:tcBorders>
+              <w:top w:val="single" w:color="auto" w:sz="4"/>
+              <w:left w:val="single" w:color="auto" w:sz="4"/>
+              <w:bottom w:val="single" w:color="auto" w:sz="4"/>
+              <w:right w:val="single" w:color="auto" w:sz="4"/>
+            </w:tcBorders>
+          </w:tcPr>
+          <w:p>
+            <w:r>
               <w:t xml:space="preserve">custom_vehicle_types, custom_vehicle_brands</w:t>
             </w:r>
           </w:p>
@@ -1352,14 +1430,15 @@
         <w:tc>
           <w:tcPr>
             <w:tcW w:type="pct" w:w="40%"/>
-          </w:tcPr>
-          <w:p>
-            <w:r>
-              <w:rPr>
-                <w:b w:val="false"/>
-                <w:bCs w:val="false"/>
-                <w:color w:val="000000"/>
-              </w:rPr>
+            <w:tcBorders>
+              <w:top w:val="single" w:color="auto" w:sz="4"/>
+              <w:left w:val="single" w:color="auto" w:sz="4"/>
+              <w:bottom w:val="single" w:color="auto" w:sz="4"/>
+              <w:right w:val="single" w:color="auto" w:sz="4"/>
+            </w:tcBorders>
+          </w:tcPr>
+          <w:p>
+            <w:r>
               <w:t xml:space="preserve">Support &amp; gouvernance</w:t>
             </w:r>
           </w:p>
@@ -1367,14 +1446,15 @@
         <w:tc>
           <w:tcPr>
             <w:tcW w:type="pct" w:w="60%"/>
-          </w:tcPr>
-          <w:p>
-            <w:r>
-              <w:rPr>
-                <w:b w:val="false"/>
-                <w:bCs w:val="false"/>
-                <w:color w:val="000000"/>
-              </w:rPr>
+            <w:tcBorders>
+              <w:top w:val="single" w:color="auto" w:sz="4"/>
+              <w:left w:val="single" w:color="auto" w:sz="4"/>
+              <w:bottom w:val="single" w:color="auto" w:sz="4"/>
+              <w:right w:val="single" w:color="auto" w:sz="4"/>
+            </w:tcBorders>
+          </w:tcPr>
+          <w:p>
+            <w:r>
               <w:t xml:space="preserve">disputes, audit_log</w:t>
             </w:r>
           </w:p>
@@ -1383,11 +1463,8 @@
     </w:tbl>
     <w:p>
       <w:pPr>
-        <w:spacing w:after="120"/>
-      </w:pPr>
-      <w:r>
-        <w:t xml:space="preserve"/>
-      </w:r>
+        <w:spacing w:after="0"/>
+      </w:pPr>
     </w:p>
     <w:p>
       <w:pPr>
@@ -1460,6 +1537,45 @@
       </w:pPr>
       <w:r>
         <w:t xml:space="preserve">Aucun statut "expiré" n'est écrit par un job : deriveSuperUserStatus() et deriveAdStatus() recalculent ACTIVE vs EXPIRED à la lecture en comparant expires_at à l'heure courante.</w:t>
+      </w:r>
+    </w:p>
+    <w:p>
+      <w:pPr>
+        <w:pStyle w:val="ListParagraph"/>
+        <w:numPr>
+          <w:ilvl w:val="0"/>
+          <w:numId w:val="1"/>
+        </w:numPr>
+        <w:spacing w:after="60"/>
+      </w:pPr>
+      <w:r>
+        <w:t xml:space="preserve">reservations.assigned_washer_names (text[], nullable) porte les noms de tous les laveurs assignés à un lavage à plusieurs (véhicules volumineux, catégorie "Camion") ; assigned_to_name continue de porter le laveur principal seul, pour rester compatible avec tout le code qui ne lit que ce champ (Analytics, historique) — voir section 7.7.</w:t>
+      </w:r>
+    </w:p>
+    <w:p>
+      <w:pPr>
+        <w:pStyle w:val="ListParagraph"/>
+        <w:numPr>
+          <w:ilvl w:val="0"/>
+          <w:numId w:val="1"/>
+        </w:numPr>
+        <w:spacing w:after="60"/>
+      </w:pPr>
+      <w:r>
+        <w:t xml:space="preserve">super_user_subscriptions.plan ('PLUS' | 'SUPER_USER', défaut 'SUPER_USER') distingue depuis le 22 août 2026 les deux paliers payants automobiliste ; le défaut préserve les abonnés déjà actifs (payés 5 000 FCFA avant l'existence du palier Plus) au lieu de les rétrograder silencieusement.</w:t>
+      </w:r>
+    </w:p>
+    <w:p>
+      <w:pPr>
+        <w:pStyle w:val="ListParagraph"/>
+        <w:numPr>
+          <w:ilvl w:val="0"/>
+          <w:numId w:val="1"/>
+        </w:numPr>
+        <w:spacing w:after="60"/>
+      </w:pPr>
+      <w:r>
+        <w:t xml:space="preserve">station_billing.trial_ends_at date la fin de l'essai gratuit d'un mois d'une station, rétro-rempli depuis stations.created_at pour les stations existantes et posé automatiquement par le trigger handle_new_station() pour les nouvelles — voir section 7.9.</w:t>
       </w:r>
     </w:p>
     <w:p>
@@ -1524,7 +1640,7 @@
         <w:spacing w:after="60"/>
       </w:pPr>
       <w:r>
-        <w:t xml:space="preserve">is_super_user(uid) — vrai si abonnement Super User ACTIVE et non expiré.</w:t>
+        <w:t xml:space="preserve">client_vehicle_cap(uid) — renvoie le plafond de véhicules réel de l'automobiliste selon son offre (2 gratuit, 5 Plus, illimité Super User) ; remplace depuis le 22 août 2026 l'ancien booléen is_super_user(uid), incapable d'exprimer plus de deux paliers.</w:t>
       </w:r>
     </w:p>
     <w:p>
@@ -1551,6 +1667,19 @@
       </w:pPr>
       <w:r>
         <w:t xml:space="preserve">find_vehicle_owner(p_plate) — retrouve le compte automobiliste propriétaire d'une plaque, réservé aux rôles admin/super_admin, n'expose que nom/catégorie/marque (jamais téléphone/email) — voir section 7.6.</w:t>
+      </w:r>
+    </w:p>
+    <w:p>
+      <w:pPr>
+        <w:pStyle w:val="ListParagraph"/>
+        <w:numPr>
+          <w:ilvl w:val="0"/>
+          <w:numId w:val="1"/>
+        </w:numPr>
+        <w:spacing w:after="60"/>
+      </w:pPr>
+      <w:r>
+        <w:t xml:space="preserve">client_push_back_reservation(p_reservation_id, p_positions) — permet à un automobiliste abonné à une station de reculer lui-même sa réservation de N places (ou jusqu'à la dernière) dans la file d'attente, en échangeant son created_at avec celui d'une réservation plus loin. Un client ne pouvant modifier que sa propre ligne via les policies RLS classiques, cette fonction security definer est le seul moyen d'écrire aussi sur la ligne d'un autre client — elle ne regarde jamais que des réservations créées APRÈS la sienne, donc ne peut structurellement jamais faire avancer l'appelant. Voir section 7.8.</w:t>
       </w:r>
     </w:p>
     <w:p>
@@ -1576,15 +1705,15 @@
         <w:spacing w:after="120" w:before="240"/>
       </w:pPr>
       <w:r>
-        <w:t xml:space="preserve">6.3 Exemple : limite Super User (2 véhicules gratuits)</w:t>
-      </w:r>
-    </w:p>
-    <w:p>
-      <w:pPr>
-        <w:spacing w:after="120"/>
-      </w:pPr>
-      <w:r>
-        <w:t xml:space="preserve">La policy vehicles_insert bloque l'ajout d'un 3ᵉ véhicule côté serveur, sauf si is_super_user(auth.uid()) renvoie vrai — la limite de l'offre gratuite est donc appliquée par Postgres, pas seulement par l'interface. Cette même policy restrictive (owner_id = auth.uid()) empêche par ailleurs un admin de station de lire directement le véhicule d'un autre client — d'où le besoin de find_vehicle_owner (section 7.6) pour la reconnaissance par plaque.</w:t>
+        <w:t xml:space="preserve">6.3 Exemple : plafond de véhicules par palier (Gratuit / Plus / Super User)</w:t>
+      </w:r>
+    </w:p>
+    <w:p>
+      <w:pPr>
+        <w:spacing w:after="120"/>
+      </w:pPr>
+      <w:r>
+        <w:t xml:space="preserve">La policy vehicles_insert compare le nombre de véhicules déjà possédés au plafond renvoyé par client_vehicle_cap(auth.uid()) — une fonction entière (2 pour l'offre gratuite, 5 pour Plus, illimité pour Super User) qui a remplacé le 22 août 2026 le booléen is_super_user(uid), incapable d'exprimer un 3ᵉ palier. La limite de chaque offre est donc appliquée par Postgres, pas seulement par l'interface. Cette même policy restrictive (owner_id = auth.uid()) empêche par ailleurs un admin de station de lire directement le véhicule d'un autre client — d'où le besoin de find_vehicle_owner (section 7.6) pour la reconnaissance par plaque.</w:t>
       </w:r>
     </w:p>
     <w:p>
@@ -1762,7 +1891,13 @@
         <w:tc>
           <w:tcPr>
             <w:tcW w:type="pct" w:w="22%"/>
-            <w:shd w:fill="1F3864"/>
+            <w:tcBorders>
+              <w:top w:val="single" w:color="auto" w:sz="4"/>
+              <w:left w:val="single" w:color="auto" w:sz="4"/>
+              <w:bottom w:val="single" w:color="auto" w:sz="4"/>
+              <w:right w:val="single" w:color="auto" w:sz="4"/>
+            </w:tcBorders>
+            <w:shd w:fill="1F3864" w:color="1F3864" w:val="solid"/>
           </w:tcPr>
           <w:p>
             <w:r>
@@ -1778,7 +1913,13 @@
         <w:tc>
           <w:tcPr>
             <w:tcW w:type="pct" w:w="39%"/>
-            <w:shd w:fill="1F3864"/>
+            <w:tcBorders>
+              <w:top w:val="single" w:color="auto" w:sz="4"/>
+              <w:left w:val="single" w:color="auto" w:sz="4"/>
+              <w:bottom w:val="single" w:color="auto" w:sz="4"/>
+              <w:right w:val="single" w:color="auto" w:sz="4"/>
+            </w:tcBorders>
+            <w:shd w:fill="1F3864" w:color="1F3864" w:val="solid"/>
           </w:tcPr>
           <w:p>
             <w:r>
@@ -1787,14 +1928,20 @@
                 <w:bCs/>
                 <w:color w:val="FFFFFF"/>
               </w:rPr>
-              <w:t xml:space="preserve">Abonnement Super User</w:t>
+              <w:t xml:space="preserve">Abonnement Plus / Super User</w:t>
             </w:r>
           </w:p>
         </w:tc>
         <w:tc>
           <w:tcPr>
             <w:tcW w:type="pct" w:w="39%"/>
-            <w:shd w:fill="1F3864"/>
+            <w:tcBorders>
+              <w:top w:val="single" w:color="auto" w:sz="4"/>
+              <w:left w:val="single" w:color="auto" w:sz="4"/>
+              <w:bottom w:val="single" w:color="auto" w:sz="4"/>
+              <w:right w:val="single" w:color="auto" w:sz="4"/>
+            </w:tcBorders>
+            <w:shd w:fill="1F3864" w:color="1F3864" w:val="solid"/>
           </w:tcPr>
           <w:p>
             <w:r>
@@ -1812,14 +1959,15 @@
         <w:tc>
           <w:tcPr>
             <w:tcW w:type="pct" w:w="22%"/>
-          </w:tcPr>
-          <w:p>
-            <w:r>
-              <w:rPr>
-                <w:b w:val="false"/>
-                <w:bCs w:val="false"/>
-                <w:color w:val="000000"/>
-              </w:rPr>
+            <w:tcBorders>
+              <w:top w:val="single" w:color="auto" w:sz="4"/>
+              <w:left w:val="single" w:color="auto" w:sz="4"/>
+              <w:bottom w:val="single" w:color="auto" w:sz="4"/>
+              <w:right w:val="single" w:color="auto" w:sz="4"/>
+            </w:tcBorders>
+          </w:tcPr>
+          <w:p>
+            <w:r>
               <w:t xml:space="preserve">Qui paie</w:t>
             </w:r>
           </w:p>
@@ -1827,14 +1975,15 @@
         <w:tc>
           <w:tcPr>
             <w:tcW w:type="pct" w:w="39%"/>
-          </w:tcPr>
-          <w:p>
-            <w:r>
-              <w:rPr>
-                <w:b w:val="false"/>
-                <w:bCs w:val="false"/>
-                <w:color w:val="000000"/>
-              </w:rPr>
+            <w:tcBorders>
+              <w:top w:val="single" w:color="auto" w:sz="4"/>
+              <w:left w:val="single" w:color="auto" w:sz="4"/>
+              <w:bottom w:val="single" w:color="auto" w:sz="4"/>
+              <w:right w:val="single" w:color="auto" w:sz="4"/>
+            </w:tcBorders>
+          </w:tcPr>
+          <w:p>
+            <w:r>
               <w:t xml:space="preserve">Automobiliste</w:t>
             </w:r>
           </w:p>
@@ -1842,14 +1991,15 @@
         <w:tc>
           <w:tcPr>
             <w:tcW w:type="pct" w:w="39%"/>
-          </w:tcPr>
-          <w:p>
-            <w:r>
-              <w:rPr>
-                <w:b w:val="false"/>
-                <w:bCs w:val="false"/>
-                <w:color w:val="000000"/>
-              </w:rPr>
+            <w:tcBorders>
+              <w:top w:val="single" w:color="auto" w:sz="4"/>
+              <w:left w:val="single" w:color="auto" w:sz="4"/>
+              <w:bottom w:val="single" w:color="auto" w:sz="4"/>
+              <w:right w:val="single" w:color="auto" w:sz="4"/>
+            </w:tcBorders>
+          </w:tcPr>
+          <w:p>
+            <w:r>
               <w:t xml:space="preserve">Station</w:t>
             </w:r>
           </w:p>
@@ -1859,14 +2009,15 @@
         <w:tc>
           <w:tcPr>
             <w:tcW w:type="pct" w:w="22%"/>
-          </w:tcPr>
-          <w:p>
-            <w:r>
-              <w:rPr>
-                <w:b w:val="false"/>
-                <w:bCs w:val="false"/>
-                <w:color w:val="000000"/>
-              </w:rPr>
+            <w:tcBorders>
+              <w:top w:val="single" w:color="auto" w:sz="4"/>
+              <w:left w:val="single" w:color="auto" w:sz="4"/>
+              <w:bottom w:val="single" w:color="auto" w:sz="4"/>
+              <w:right w:val="single" w:color="auto" w:sz="4"/>
+            </w:tcBorders>
+          </w:tcPr>
+          <w:p>
+            <w:r>
               <w:t xml:space="preserve">Montant</w:t>
             </w:r>
           </w:p>
@@ -1874,29 +2025,31 @@
         <w:tc>
           <w:tcPr>
             <w:tcW w:type="pct" w:w="39%"/>
-          </w:tcPr>
-          <w:p>
-            <w:r>
-              <w:rPr>
-                <w:b w:val="false"/>
-                <w:bCs w:val="false"/>
-                <w:color w:val="000000"/>
-              </w:rPr>
-              <w:t xml:space="preserve">5 000 FCFA / mois</w:t>
+            <w:tcBorders>
+              <w:top w:val="single" w:color="auto" w:sz="4"/>
+              <w:left w:val="single" w:color="auto" w:sz="4"/>
+              <w:bottom w:val="single" w:color="auto" w:sz="4"/>
+              <w:right w:val="single" w:color="auto" w:sz="4"/>
+            </w:tcBorders>
+          </w:tcPr>
+          <w:p>
+            <w:r>
+              <w:t xml:space="preserve">2 500 FCFA/mois (Plus) · 5 000 FCFA/mois (Super User)</w:t>
             </w:r>
           </w:p>
         </w:tc>
         <w:tc>
           <w:tcPr>
             <w:tcW w:type="pct" w:w="39%"/>
-          </w:tcPr>
-          <w:p>
-            <w:r>
-              <w:rPr>
-                <w:b w:val="false"/>
-                <w:bCs w:val="false"/>
-                <w:color w:val="000000"/>
-              </w:rPr>
+            <w:tcBorders>
+              <w:top w:val="single" w:color="auto" w:sz="4"/>
+              <w:left w:val="single" w:color="auto" w:sz="4"/>
+              <w:bottom w:val="single" w:color="auto" w:sz="4"/>
+              <w:right w:val="single" w:color="auto" w:sz="4"/>
+            </w:tcBorders>
+          </w:tcPr>
+          <w:p>
+            <w:r>
               <w:t xml:space="preserve">5 000 F / 3j · 10 000 F / 7j · 30 000 F / 30j (au choix)</w:t>
             </w:r>
           </w:p>
@@ -1906,14 +2059,15 @@
         <w:tc>
           <w:tcPr>
             <w:tcW w:type="pct" w:w="22%"/>
-          </w:tcPr>
-          <w:p>
-            <w:r>
-              <w:rPr>
-                <w:b w:val="false"/>
-                <w:bCs w:val="false"/>
-                <w:color w:val="000000"/>
-              </w:rPr>
+            <w:tcBorders>
+              <w:top w:val="single" w:color="auto" w:sz="4"/>
+              <w:left w:val="single" w:color="auto" w:sz="4"/>
+              <w:bottom w:val="single" w:color="auto" w:sz="4"/>
+              <w:right w:val="single" w:color="auto" w:sz="4"/>
+            </w:tcBorders>
+          </w:tcPr>
+          <w:p>
+            <w:r>
               <w:t xml:space="preserve">Qui confirme</w:t>
             </w:r>
           </w:p>
@@ -1921,14 +2075,15 @@
         <w:tc>
           <w:tcPr>
             <w:tcW w:type="pct" w:w="39%"/>
-          </w:tcPr>
-          <w:p>
-            <w:r>
-              <w:rPr>
-                <w:b w:val="false"/>
-                <w:bCs w:val="false"/>
-                <w:color w:val="000000"/>
-              </w:rPr>
+            <w:tcBorders>
+              <w:top w:val="single" w:color="auto" w:sz="4"/>
+              <w:left w:val="single" w:color="auto" w:sz="4"/>
+              <w:bottom w:val="single" w:color="auto" w:sz="4"/>
+              <w:right w:val="single" w:color="auto" w:sz="4"/>
+            </w:tcBorders>
+          </w:tcPr>
+          <w:p>
+            <w:r>
               <w:t xml:space="preserve">Super Admin</w:t>
             </w:r>
           </w:p>
@@ -1936,14 +2091,15 @@
         <w:tc>
           <w:tcPr>
             <w:tcW w:type="pct" w:w="39%"/>
-          </w:tcPr>
-          <w:p>
-            <w:r>
-              <w:rPr>
-                <w:b w:val="false"/>
-                <w:bCs w:val="false"/>
-                <w:color w:val="000000"/>
-              </w:rPr>
+            <w:tcBorders>
+              <w:top w:val="single" w:color="auto" w:sz="4"/>
+              <w:left w:val="single" w:color="auto" w:sz="4"/>
+              <w:bottom w:val="single" w:color="auto" w:sz="4"/>
+              <w:right w:val="single" w:color="auto" w:sz="4"/>
+            </w:tcBorders>
+          </w:tcPr>
+          <w:p>
+            <w:r>
               <w:t xml:space="preserve">Super Admin</w:t>
             </w:r>
           </w:p>
@@ -1953,14 +2109,15 @@
         <w:tc>
           <w:tcPr>
             <w:tcW w:type="pct" w:w="22%"/>
-          </w:tcPr>
-          <w:p>
-            <w:r>
-              <w:rPr>
-                <w:b w:val="false"/>
-                <w:bCs w:val="false"/>
-                <w:color w:val="000000"/>
-              </w:rPr>
+            <w:tcBorders>
+              <w:top w:val="single" w:color="auto" w:sz="4"/>
+              <w:left w:val="single" w:color="auto" w:sz="4"/>
+              <w:bottom w:val="single" w:color="auto" w:sz="4"/>
+              <w:right w:val="single" w:color="auto" w:sz="4"/>
+            </w:tcBorders>
+          </w:tcPr>
+          <w:p>
+            <w:r>
               <w:t xml:space="preserve">Effet une fois ACTIVE</w:t>
             </w:r>
           </w:p>
@@ -1968,29 +2125,31 @@
         <w:tc>
           <w:tcPr>
             <w:tcW w:type="pct" w:w="39%"/>
-          </w:tcPr>
-          <w:p>
-            <w:r>
-              <w:rPr>
-                <w:b w:val="false"/>
-                <w:bCs w:val="false"/>
-                <w:color w:val="000000"/>
-              </w:rPr>
-              <w:t xml:space="preserve">Plus de plafond de 2 véhicules gratuits</w:t>
+            <w:tcBorders>
+              <w:top w:val="single" w:color="auto" w:sz="4"/>
+              <w:left w:val="single" w:color="auto" w:sz="4"/>
+              <w:bottom w:val="single" w:color="auto" w:sz="4"/>
+              <w:right w:val="single" w:color="auto" w:sz="4"/>
+            </w:tcBorders>
+          </w:tcPr>
+          <w:p>
+            <w:r>
+              <w:t xml:space="preserve">Plafond de véhicules relevé à 5 (Plus) ou illimité (Super User)</w:t>
             </w:r>
           </w:p>
         </w:tc>
         <w:tc>
           <w:tcPr>
             <w:tcW w:type="pct" w:w="39%"/>
-          </w:tcPr>
-          <w:p>
-            <w:r>
-              <w:rPr>
-                <w:b w:val="false"/>
-                <w:bCs w:val="false"/>
-                <w:color w:val="000000"/>
-              </w:rPr>
+            <w:tcBorders>
+              <w:top w:val="single" w:color="auto" w:sz="4"/>
+              <w:left w:val="single" w:color="auto" w:sz="4"/>
+              <w:bottom w:val="single" w:color="auto" w:sz="4"/>
+              <w:right w:val="single" w:color="auto" w:sz="4"/>
+            </w:tcBorders>
+          </w:tcPr>
+          <w:p>
+            <w:r>
               <w:t xml:space="preserve">Diffusion sur le tableau de bord de tous les automobilistes + mise en avant sur /stations</w:t>
             </w:r>
           </w:p>
@@ -1999,11 +2158,8 @@
     </w:tbl>
     <w:p>
       <w:pPr>
-        <w:spacing w:after="120"/>
-      </w:pPr>
-      <w:r>
-        <w:t xml:space="preserve"/>
-      </w:r>
+        <w:spacing w:after="0"/>
+      </w:pPr>
     </w:p>
     <w:p>
       <w:pPr>
@@ -2066,7 +2222,7 @@
         <w:spacing w:after="60"/>
       </w:pPr>
       <w:r>
-        <w:t xml:space="preserve">"À la une" (nouveau, 21 août 2026) : une station avec une publicité ACTIVE est désormais aussi mise en avant sur la page publique "Trouver une station" (/stations, accessible sans compte) — badge "⭐ À la une", message affiché, et épinglée en tête de liste avant le tri par distance. Réutilise entièrement les mêmes données station_ads, sans nouveau système ni nouvelle table : une seconde surface d'affichage pour la même campagne.</w:t>
+        <w:t xml:space="preserve">"À la une" (21 août 2026) : une station avec une publicité ACTIVE est aussi mise en avant sur la page publique "Trouver une station" (/stations, accessible sans compte) — badge "⭐ À la une", message affiché, et épinglée en tête de liste avant le tri par distance. Réutilise entièrement les mêmes données station_ads, sans nouveau système ni nouvelle table : une seconde surface d'affichage pour la même campagne.</w:t>
       </w:r>
     </w:p>
     <w:p>
@@ -2230,6 +2386,148 @@
     </w:p>
     <w:p>
       <w:pPr>
+        <w:pStyle w:val="Heading2"/>
+        <w:spacing w:after="120" w:before="240"/>
+      </w:pPr>
+      <w:r>
+        <w:t xml:space="preserve">7.7 Lavage à plusieurs laveurs (véhicules volumineux)</w:t>
+      </w:r>
+    </w:p>
+    <w:p>
+      <w:pPr>
+        <w:spacing w:after="120"/>
+      </w:pPr>
+      <w:r>
+        <w:t xml:space="preserve">Depuis le 24 août 2026, un lavage dont la catégorie tarifaire est "Camion" (regroupe Bus/Car +50 places et camions léger/lourd, voir PRICING_CATEGORY_LABELS dans lib/vehicleBrands.js) ouvre une modale dédiée au clic sur "Go" : la station choisit librement 1 à 3 laveurs parmi les disponibles (MAX_WASHERS_PER_WASH = 3, StationDashboard.jsx) plutôt que le laveur unique habituel. startWash(id, employeeIdOrIds) accepte désormais un seul identifiant ou un tableau d'identifiants. reservations.assigned_to_name garde le premier laveur (compatibilité avec le code existant qui ne lit que ce champ), assigned_washer_names (nouvelle colonne text[]) ne contient une valeur que si plusieurs laveurs sont assignés.</w:t>
+      </w:r>
+    </w:p>
+    <w:p>
+      <w:pPr>
+        <w:pStyle w:val="ListParagraph"/>
+        <w:numPr>
+          <w:ilvl w:val="0"/>
+          <w:numId w:val="1"/>
+        </w:numPr>
+        <w:spacing w:after="60"/>
+      </w:pPr>
+      <w:r>
+        <w:t xml:space="preserve">Tant que le lavage n'est pas terminé, tous les laveurs assignés sont marqués occupés et exclus de availableEmployees — pas seulement le premier.</w:t>
+      </w:r>
+    </w:p>
+    <w:p>
+      <w:pPr>
+        <w:pStyle w:val="ListParagraph"/>
+        <w:numPr>
+          <w:ilvl w:val="0"/>
+          <w:numId w:val="1"/>
+        </w:numPr>
+        <w:spacing w:after="60"/>
+      </w:pPr>
+      <w:r>
+        <w:t xml:space="preserve">Le classement "Top Laveurs" d'Analytics crédite désormais chacun des laveurs d'un lavage à plusieurs, pas seulement le laveur principal.</w:t>
+      </w:r>
+    </w:p>
+    <w:p>
+      <w:pPr>
+        <w:pStyle w:val="Heading2"/>
+        <w:spacing w:after="120" w:before="240"/>
+      </w:pPr>
+      <w:r>
+        <w:t xml:space="preserve">7.8 Report de position en file d'attente</w:t>
+      </w:r>
+    </w:p>
+    <w:p>
+      <w:pPr>
+        <w:spacing w:after="120"/>
+      </w:pPr>
+      <w:r>
+        <w:t xml:space="preserve">Un mécanisme d'échange de position existait déjà côté station (pushBackOnePosition, useAppState.jsx) : comme la position et le temps d'attente estimé sont purement dérivés du tri par created_at (getItemPosition, estimateItemWaitTime dans lib/stationData.js), reculer une réservation revient à échanger son created_at avec celui d'une autre. Depuis le 22 août 2026, un automobiliste abonné à la station (station_client_subscriptions actif) peut faire ce même geste lui-même, depuis son tableau de bord, pour 2, 3, 4 places ou directement la dernière (valeur sentinelle positions=999, qui se déclenche aussi si le nombre de places demandé dépasse la longueur de la file).</w:t>
+      </w:r>
+    </w:p>
+    <w:p>
+      <w:pPr>
+        <w:pStyle w:val="ListParagraph"/>
+        <w:numPr>
+          <w:ilvl w:val="0"/>
+          <w:numId w:val="1"/>
+        </w:numPr>
+        <w:spacing w:after="60"/>
+      </w:pPr>
+      <w:r>
+        <w:t xml:space="preserve">Comme un client ne peut modifier que sa propre réservation sous RLS, l'opération passe par client_push_back_reservation (section 6.1), une fonction security definer qui vérifie la propriété de la réservation et la présence d'un abonnement actif à cette station, avant de faire l'échange.</w:t>
+      </w:r>
+    </w:p>
+    <w:p>
+      <w:pPr>
+        <w:pStyle w:val="ListParagraph"/>
+        <w:numPr>
+          <w:ilvl w:val="0"/>
+          <w:numId w:val="1"/>
+        </w:numPr>
+        <w:spacing w:after="60"/>
+      </w:pPr>
+      <w:r>
+        <w:t xml:space="preserve">Elle ne considère jamais que des réservations créées après la sienne : structurellement incapable de faire avancer l'appelant, seulement de le reculer.</w:t>
+      </w:r>
+    </w:p>
+    <w:p>
+      <w:pPr>
+        <w:pStyle w:val="ListParagraph"/>
+        <w:numPr>
+          <w:ilvl w:val="0"/>
+          <w:numId w:val="1"/>
+        </w:numPr>
+        <w:spacing w:after="60"/>
+      </w:pPr>
+      <w:r>
+        <w:t xml:space="preserve">Le flag hasSubscription affiché côté client (Dashboard.jsx) n'est qu'un indice d'UI pour afficher le bouton ; le vrai contrôle d'accès est entièrement côté fonction SQL — une incohérence de synchronisation dégrade proprement (simple erreur affichée), sans corrompre de donnée.</w:t>
+      </w:r>
+    </w:p>
+    <w:p>
+      <w:pPr>
+        <w:pStyle w:val="Heading2"/>
+        <w:spacing w:after="120" w:before="240"/>
+      </w:pPr>
+      <w:r>
+        <w:t xml:space="preserve">7.9 Essai gratuit d'un mois pour les stations</w:t>
+      </w:r>
+    </w:p>
+    <w:p>
+      <w:pPr>
+        <w:spacing w:after="120"/>
+      </w:pPr>
+      <w:r>
+        <w:t xml:space="preserve">Depuis le 22 août 2026, station_billing.trial_ends_at date la fin de l'essai gratuit d'une station (1 mois) — auparavant, subscription_status pouvait valoir 'essai' mais sans aucune date bornant sa durée. Les stations déjà en essai au moment de la migration ont été rétro-remplies à partir de stations.created_at (pas "maintenant", pour ne pas leur offrir de mois gratuit supplémentaire) ; toute nouvelle station reçoit désormais trial_ends_at = now() + 1 mois via le trigger handle_new_station().</w:t>
+      </w:r>
+    </w:p>
+    <w:p>
+      <w:pPr>
+        <w:pStyle w:val="ListParagraph"/>
+        <w:numPr>
+          <w:ilvl w:val="0"/>
+          <w:numId w:val="1"/>
+        </w:numPr>
+        <w:spacing w:after="60"/>
+      </w:pPr>
+      <w:r>
+        <w:t xml:space="preserve">lib/stationTrial.js centralise le calcul (trialDaysRemaining, trialProgressPercent, trialUrgency) pour que la bannière station (TrialBanner.jsx, montée dans AdminLayout.jsx) et le suivi Super Admin (SuperAdmin/Billing.jsx) restent cohérents : la barre se remplit au fil des jours (et non l'inverse), et passe de vert à orange puis rouge à l'approche de l'expiration.</w:t>
+      </w:r>
+    </w:p>
+    <w:p>
+      <w:pPr>
+        <w:pStyle w:val="ListParagraph"/>
+        <w:numPr>
+          <w:ilvl w:val="0"/>
+          <w:numId w:val="1"/>
+        </w:numPr>
+        <w:spacing w:after="60"/>
+      </w:pPr>
+      <w:r>
+        <w:t xml:space="preserve">Comme pour la facturation station en général, rien ne bascule automatiquement subscription_status à l'expiration — seule une action manuelle du Super Admin (markSubscriptionPaid/markSubscriptionOverdue) fait évoluer le statut. La bannière reste purement informative, et masquée pendant une impersonation Super Admin (qui affiche déjà sa propre bannière).</w:t>
+      </w:r>
+    </w:p>
+    <w:p>
+      <w:pPr>
         <w:pStyle w:val="Heading1"/>
         <w:spacing w:after="160" w:before="360"/>
       </w:pPr>
@@ -2433,6 +2731,19 @@
         <w:spacing w:after="60"/>
       </w:pPr>
       <w:r>
+        <w:t xml:space="preserve">Le plafond de véhicules par palier est dupliqué entre client_vehicle_cap() côté SQL (section 6.1) et vehicleCapFor() côté JS (src/lib/superUser.js) — les deux doivent être maintenus synchronisés manuellement à chaque évolution des paliers, sans test automatisé pour le garantir.</w:t>
+      </w:r>
+    </w:p>
+    <w:p>
+      <w:pPr>
+        <w:pStyle w:val="ListParagraph"/>
+        <w:numPr>
+          <w:ilvl w:val="0"/>
+          <w:numId w:val="1"/>
+        </w:numPr>
+        <w:spacing w:after="60"/>
+      </w:pPr>
+      <w:r>
         <w:t xml:space="preserve">Fichiers HTML legacy à la racine du dépôt : dead code jamais servi, conservés uniquement comme référence de maquettes historiques.</w:t>
       </w:r>
     </w:p>
@@ -2451,7 +2762,7 @@
     </w:p>
     <w:p>
       <w:pPr>
-        <w:spacing w:after="120"/>
+        <w:spacing w:after="200"/>
       </w:pPr>
       <w:r>
         <w:rPr>

</xml_diff>

<commit_message>
docs: Refresh architecture doc — SEO pass (section 8 + 9)
Section 8 (marketing/SEO): JSON-LD now Organization + SoftwareApplication
+ WebSite + FAQPage (LocalBusiness dropped), GA4 live (G-6EFQN7CBB8),
vercel.json routing + soft-404 removal, dashboard.html noindex, trimmed
sitemap/robots, Google Search Console domain property verified.
Section 9: drop the "GA not active" debt, add the Tailwind play-CDN and
consumer-vs-B2B H1 mismatch debts. Header date bumped to 1 sept. 2026.

Co-Authored-By: Claude Sonnet 5 <noreply@anthropic.com>
</commit_message>
<xml_diff>
--- a/docs/Architecture-Technique-CleanCarGalsen.docx
+++ b/docs/Architecture-Technique-CleanCarGalsen.docx
@@ -57,7 +57,7 @@
           <w:iCs/>
           <w:color w:val="595959"/>
         </w:rPr>
-        <w:t xml:space="preserve">Généré le 19 août 2026 — mis à jour le 24 août 2026</w:t>
+        <w:t xml:space="preserve">Généré le 19 août 2026 — mis à jour le 1 septembre 2026</w:t>
       </w:r>
     </w:p>
     <w:p>
@@ -761,7 +761,7 @@
         <w:spacing w:after="120"/>
       </w:pPr>
       <w:r>
-        <w:t xml:space="preserve">Pages statiques additionnelles (public/) : 404.html, merci.html et confidentialite.html sont de VRAIES pages servies en production, mais copiées telles quelles au build (aucun traitement Vite, pas de bundling) — comme robots.txt ou sitemap.xml.</w:t>
+        <w:t xml:space="preserve">Pages statiques additionnelles (public/) : 404.html, merci.html, confidentialite.html et conditions-generales.html sont de VRAIES pages servies en production, mais copiées telles quelles au build (aucun traitement Vite, pas de bundling) — comme robots.txt ou sitemap.xml.</w:t>
       </w:r>
     </w:p>
     <w:p>
@@ -2540,59 +2540,59 @@
         <w:spacing w:after="120"/>
       </w:pPr>
       <w:r>
-        <w:t xml:space="preserve">Les 4 points d'entrée statiques (index.html, login.html, dashboard.html, reset-password.html) et 3 pages autonomes portent les fondamentaux SEO/marketing d'un site vitrine :</w:t>
-      </w:r>
-    </w:p>
-    <w:p>
-      <w:pPr>
-        <w:pStyle w:val="ListParagraph"/>
-        <w:numPr>
-          <w:ilvl w:val="0"/>
-          <w:numId w:val="1"/>
-        </w:numPr>
-        <w:spacing w:after="60"/>
-      </w:pPr>
-      <w:r>
-        <w:t xml:space="preserve">Meta descriptions, Open Graph / Twitter Card, URL canonique, et données structurées JSON-LD (LocalBusiness + WebSite) sur index.html.</w:t>
-      </w:r>
-    </w:p>
-    <w:p>
-      <w:pPr>
-        <w:pStyle w:val="ListParagraph"/>
-        <w:numPr>
-          <w:ilvl w:val="0"/>
-          <w:numId w:val="1"/>
-        </w:numPr>
-        <w:spacing w:after="60"/>
-      </w:pPr>
-      <w:r>
-        <w:t xml:space="preserve">Google Analytics (GA4) scaffoldé sur les 4 points d'entrée — identifiant de mesure encore en placeholder (G-XXXXXXXXXX) à remplacer par le vrai avant mise en production.</w:t>
-      </w:r>
-    </w:p>
-    <w:p>
-      <w:pPr>
-        <w:pStyle w:val="ListParagraph"/>
-        <w:numPr>
-          <w:ilvl w:val="0"/>
-          <w:numId w:val="1"/>
-        </w:numPr>
-        <w:spacing w:after="60"/>
-      </w:pPr>
-      <w:r>
-        <w:t xml:space="preserve">3 pages statiques dans public/ (copiées telles quelles au build, aucun traitement Vite) : 404.html, merci.html, confidentialite.html.</w:t>
-      </w:r>
-    </w:p>
-    <w:p>
-      <w:pPr>
-        <w:pStyle w:val="ListParagraph"/>
-        <w:numPr>
-          <w:ilvl w:val="0"/>
-          <w:numId w:val="1"/>
-        </w:numPr>
-        <w:spacing w:after="60"/>
-      </w:pPr>
-      <w:r>
-        <w:t xml:space="preserve">public/_redirects : un chemin inconnu renvoie une vraie 404.html (statut HTTP 404) au lieu de retomber silencieusement sur l'accueil.</w:t>
+        <w:t xml:space="preserve">Les 4 points d'entrée statiques (index.html, login.html, dashboard.html, reset-password.html) et quelques pages autonomes portent les fondamentaux SEO/marketing d'un site vitrine :</w:t>
+      </w:r>
+    </w:p>
+    <w:p>
+      <w:pPr>
+        <w:pStyle w:val="ListParagraph"/>
+        <w:numPr>
+          <w:ilvl w:val="0"/>
+          <w:numId w:val="1"/>
+        </w:numPr>
+        <w:spacing w:after="60"/>
+      </w:pPr>
+      <w:r>
+        <w:t xml:space="preserve">Meta descriptions et titres orientés B2B ("logiciel de gestion pour station de lavage auto au Sénégal"), Open Graph / Twitter Card, URL canonique, et données structurées JSON-LD sur index.html : Organization + SoftwareApplication (les 3 forfaits SaaS en Offer) + WebSite + FAQPage. Le type LocalBusiness a été retiré le 1 septembre 2026 — l'activité est un éditeur de logiciel 100 % en ligne, sans local physique.</w:t>
+      </w:r>
+    </w:p>
+    <w:p>
+      <w:pPr>
+        <w:pStyle w:val="ListParagraph"/>
+        <w:numPr>
+          <w:ilvl w:val="0"/>
+          <w:numId w:val="1"/>
+        </w:numPr>
+        <w:spacing w:after="60"/>
+      </w:pPr>
+      <w:r>
+        <w:t xml:space="preserve">Google Analytics 4 actif depuis le 1 septembre 2026 sur les 4 points d'entrée — propriété "Clean Car Galsen", identifiant de mesure G-6EFQN7CBB8, mesures améliorées activées.</w:t>
+      </w:r>
+    </w:p>
+    <w:p>
+      <w:pPr>
+        <w:pStyle w:val="ListParagraph"/>
+        <w:numPr>
+          <w:ilvl w:val="0"/>
+          <w:numId w:val="1"/>
+        </w:numPr>
+        <w:spacing w:after="60"/>
+      </w:pPr>
+      <w:r>
+        <w:t xml:space="preserve">4 pages statiques dans public/ (copiées telles quelles au build, aucun traitement Vite) : 404.html, merci.html, confidentialite.html, conditions-generales.html.</w:t>
+      </w:r>
+    </w:p>
+    <w:p>
+      <w:pPr>
+        <w:pStyle w:val="ListParagraph"/>
+        <w:numPr>
+          <w:ilvl w:val="0"/>
+          <w:numId w:val="1"/>
+        </w:numPr>
+        <w:spacing w:after="60"/>
+      </w:pPr>
+      <w:r>
+        <w:t xml:space="preserve">Routage d'hébergement piloté par vercel.json (public/_redirects, au format Netlify, est ignoré par Vercel) : /admin/*, /superadmin/*, /dashboard et /stations sont réécrits vers dashboard.html. Le renvoi catch-all /(.*) → /index.html a été supprimé le 1 septembre 2026 : un chemin inconnu sert désormais 404.html avec un vrai statut HTTP 404, au lieu d'une fausse page 200 ("soft 404") qui polluait l'indexation.</w:t>
       </w:r>
     </w:p>
     <w:p>
@@ -2645,6 +2645,45 @@
       </w:pPr>
       <w:r>
         <w:t xml:space="preserve">Depuis le 21 août 2026, /stations met aussi en avant les stations avec une campagne publicitaire ACTIVE (badge "À la une", épinglées en tête) — voir section 7.4.</w:t>
+      </w:r>
+    </w:p>
+    <w:p>
+      <w:pPr>
+        <w:pStyle w:val="ListParagraph"/>
+        <w:numPr>
+          <w:ilvl w:val="0"/>
+          <w:numId w:val="1"/>
+        </w:numPr>
+        <w:spacing w:after="60"/>
+      </w:pPr>
+      <w:r>
+        <w:t xml:space="preserve">dashboard.html porte désormais une balise noindex (coquille React sans contenu propre à indexer), au même titre que login.html et reset-password.html ; robots.txt ne bloque plus que /admin/ et /superadmin/.</w:t>
+      </w:r>
+    </w:p>
+    <w:p>
+      <w:pPr>
+        <w:pStyle w:val="ListParagraph"/>
+        <w:numPr>
+          <w:ilvl w:val="0"/>
+          <w:numId w:val="1"/>
+        </w:numPr>
+        <w:spacing w:after="60"/>
+      </w:pPr>
+      <w:r>
+        <w:t xml:space="preserve">sitemap.xml réduit aux 3 pages réellement indexables (accueil, conditions générales, confidentialité) — /login, /dashboard et /stations en ont été retirés.</w:t>
+      </w:r>
+    </w:p>
+    <w:p>
+      <w:pPr>
+        <w:pStyle w:val="ListParagraph"/>
+        <w:numPr>
+          <w:ilvl w:val="0"/>
+          <w:numId w:val="1"/>
+        </w:numPr>
+        <w:spacing w:after="60"/>
+      </w:pPr>
+      <w:r>
+        <w:t xml:space="preserve">Google Search Console : propriété de type Domaine sur galsenautocleaner.com, vérifiée par enregistrement DNS TXT (DNS géré par Vercel) le 1 septembre 2026 — sitemap soumis, indexation de l'accueil demandée. Le référencement vise en priorité les gérants de station (requêtes B2B).</w:t>
       </w:r>
     </w:p>
     <w:p>
@@ -2757,7 +2796,20 @@
         <w:spacing w:after="60"/>
       </w:pPr>
       <w:r>
-        <w:t xml:space="preserve">Google Analytics n'est pas encore actif (identifiant de mesure placeholder).</w:t>
+        <w:t xml:space="preserve">Le CSS de la vitrine (index.html, login.html, 404.html) est chargé via le CDN "play" de Tailwind (cdn.tailwindcss.com), qui génère les classes dans le navigateur : bloquant au rendu et pénalisant pour les Core Web Vitals — un CSS Tailwind compilé reste à mettre en place.</w:t>
+      </w:r>
+    </w:p>
+    <w:p>
+      <w:pPr>
+        <w:pStyle w:val="ListParagraph"/>
+        <w:numPr>
+          <w:ilvl w:val="0"/>
+          <w:numId w:val="1"/>
+        </w:numPr>
+        <w:spacing w:after="60"/>
+      </w:pPr>
+      <w:r>
+        <w:t xml:space="preserve">Le titre principal (H1) de la page d'accueil s'adresse encore aux automobilistes ("Votre lavage de confiance à Dakar") alors que le référencement et les CTA visent les gérants de station : incohérence de message à corriger.</w:t>
       </w:r>
     </w:p>
     <w:p>

</xml_diff>